<commit_message>
Add HLD request sequence diagram
</commit_message>
<xml_diff>
--- a/documentation/NetraJyoti_AI_High_Level_Design.docx
+++ b/documentation/NetraJyoti_AI_High_Level_Design.docx
@@ -1213,7 +1213,546 @@
           <w:color w:val="2F6FAF"/>
           <w:sz w:val="34"/>
         </w:rPr>
-        <w:t>2. Current safety boundary</w:t>
+        <w:t>2. Current request sequence</w:t>
+      </w:r>
+    </w:p>
+    <w:p>
+      <w:pPr>
+        <w:spacing w:after="100" w:line="276" w:lineRule="auto"/>
+      </w:pPr>
+      <w:r>
+        <w:rPr>
+          <w:rFonts w:ascii="Aptos" w:hAnsi="Aptos"/>
+          <w:b w:val="0"/>
+          <w:color w:val="17384B"/>
+          <w:sz w:val="20"/>
+        </w:rPr>
+        <w:t>Java makes the route decision before PostgreSQL RAG retrieval or any optional Ollama call. The sequence diagram in the published HLD shows the interaction; this table preserves the same sequence in the editable source.</w:t>
+      </w:r>
+    </w:p>
+    <w:tbl>
+      <w:tblPr>
+        <w:tblW w:type="auto" w:w="0"/>
+        <w:jc w:val="center"/>
+        <w:tblLayout w:type="fixed"/>
+        <w:tblLook w:firstColumn="1" w:firstRow="1" w:lastColumn="0" w:lastRow="0" w:noHBand="0" w:noVBand="1" w:val="04A0"/>
+      </w:tblPr>
+      <w:tblGrid>
+        <w:gridCol w:w="3389"/>
+        <w:gridCol w:w="3389"/>
+        <w:gridCol w:w="3389"/>
+      </w:tblGrid>
+      <w:tr>
+        <w:tc>
+          <w:tcPr>
+            <w:tcW w:type="dxa" w:w="1080"/>
+            <w:shd w:fill="DDE8F0"/>
+            <w:tcBorders>
+              <w:top w:val="single" w:sz="6" w:color="C7DFDB"/>
+              <w:left w:val="single" w:sz="6" w:color="C7DFDB"/>
+              <w:bottom w:val="single" w:sz="6" w:color="C7DFDB"/>
+              <w:right w:val="single" w:sz="6" w:color="C7DFDB"/>
+            </w:tcBorders>
+            <w:tcMar>
+              <w:top w:w="90" w:type="dxa"/>
+              <w:start w:w="120" w:type="dxa"/>
+              <w:bottom w:w="90" w:type="dxa"/>
+              <w:end w:w="120" w:type="dxa"/>
+            </w:tcMar>
+            <w:vAlign w:val="top"/>
+          </w:tcPr>
+          <w:p>
+            <w:pPr>
+              <w:spacing w:after="0"/>
+            </w:pPr>
+            <w:r>
+              <w:rPr>
+                <w:rFonts w:ascii="Aptos" w:hAnsi="Aptos"/>
+                <w:b/>
+                <w:color w:val="17384B"/>
+                <w:sz w:val="18"/>
+              </w:rPr>
+              <w:t>Step</w:t>
+            </w:r>
+          </w:p>
+        </w:tc>
+        <w:tc>
+          <w:tcPr>
+            <w:tcW w:type="dxa" w:w="5328"/>
+            <w:shd w:fill="DDE8F0"/>
+            <w:tcBorders>
+              <w:top w:val="single" w:sz="6" w:color="C7DFDB"/>
+              <w:left w:val="single" w:sz="6" w:color="C7DFDB"/>
+              <w:bottom w:val="single" w:sz="6" w:color="C7DFDB"/>
+              <w:right w:val="single" w:sz="6" w:color="C7DFDB"/>
+            </w:tcBorders>
+            <w:tcMar>
+              <w:top w:w="90" w:type="dxa"/>
+              <w:start w:w="120" w:type="dxa"/>
+              <w:bottom w:w="90" w:type="dxa"/>
+              <w:end w:w="120" w:type="dxa"/>
+            </w:tcMar>
+            <w:vAlign w:val="top"/>
+          </w:tcPr>
+          <w:p>
+            <w:pPr>
+              <w:spacing w:after="0"/>
+            </w:pPr>
+            <w:r>
+              <w:rPr>
+                <w:rFonts w:ascii="Aptos" w:hAnsi="Aptos"/>
+                <w:b/>
+                <w:color w:val="17384B"/>
+                <w:sz w:val="18"/>
+              </w:rPr>
+              <w:t>Interaction</w:t>
+            </w:r>
+          </w:p>
+        </w:tc>
+        <w:tc>
+          <w:tcPr>
+            <w:tcW w:type="dxa" w:w="2736"/>
+            <w:shd w:fill="DDE8F0"/>
+            <w:tcBorders>
+              <w:top w:val="single" w:sz="6" w:color="C7DFDB"/>
+              <w:left w:val="single" w:sz="6" w:color="C7DFDB"/>
+              <w:bottom w:val="single" w:sz="6" w:color="C7DFDB"/>
+              <w:right w:val="single" w:sz="6" w:color="C7DFDB"/>
+            </w:tcBorders>
+            <w:tcMar>
+              <w:top w:w="90" w:type="dxa"/>
+              <w:start w:w="120" w:type="dxa"/>
+              <w:bottom w:w="90" w:type="dxa"/>
+              <w:end w:w="120" w:type="dxa"/>
+            </w:tcMar>
+            <w:vAlign w:val="top"/>
+          </w:tcPr>
+          <w:p>
+            <w:pPr>
+              <w:spacing w:after="0"/>
+            </w:pPr>
+            <w:r>
+              <w:rPr>
+                <w:rFonts w:ascii="Aptos" w:hAnsi="Aptos"/>
+                <w:b/>
+                <w:color w:val="17384B"/>
+                <w:sz w:val="18"/>
+              </w:rPr>
+              <w:t>Control</w:t>
+            </w:r>
+          </w:p>
+        </w:tc>
+      </w:tr>
+      <w:tr>
+        <w:tc>
+          <w:tcPr>
+            <w:tcW w:type="dxa" w:w="1080"/>
+            <w:tcBorders>
+              <w:top w:val="single" w:sz="6" w:color="C7DFDB"/>
+              <w:left w:val="single" w:sz="6" w:color="C7DFDB"/>
+              <w:bottom w:val="single" w:sz="6" w:color="C7DFDB"/>
+              <w:right w:val="single" w:sz="6" w:color="C7DFDB"/>
+            </w:tcBorders>
+            <w:tcMar>
+              <w:top w:w="90" w:type="dxa"/>
+              <w:start w:w="120" w:type="dxa"/>
+              <w:bottom w:w="90" w:type="dxa"/>
+              <w:end w:w="120" w:type="dxa"/>
+            </w:tcMar>
+            <w:vAlign w:val="top"/>
+          </w:tcPr>
+          <w:p>
+            <w:pPr>
+              <w:spacing w:after="0"/>
+            </w:pPr>
+            <w:r>
+              <w:rPr>
+                <w:rFonts w:ascii="Aptos" w:hAnsi="Aptos"/>
+                <w:b w:val="0"/>
+                <w:color w:val="17384B"/>
+                <w:sz w:val="17"/>
+              </w:rPr>
+              <w:t>1-3</w:t>
+            </w:r>
+          </w:p>
+        </w:tc>
+        <w:tc>
+          <w:tcPr>
+            <w:tcW w:type="dxa" w:w="5328"/>
+            <w:tcBorders>
+              <w:top w:val="single" w:sz="6" w:color="C7DFDB"/>
+              <w:left w:val="single" w:sz="6" w:color="C7DFDB"/>
+              <w:bottom w:val="single" w:sz="6" w:color="C7DFDB"/>
+              <w:right w:val="single" w:sz="6" w:color="C7DFDB"/>
+            </w:tcBorders>
+            <w:tcMar>
+              <w:top w:w="90" w:type="dxa"/>
+              <w:start w:w="120" w:type="dxa"/>
+              <w:bottom w:w="90" w:type="dxa"/>
+              <w:end w:w="120" w:type="dxa"/>
+            </w:tcMar>
+            <w:vAlign w:val="top"/>
+          </w:tcPr>
+          <w:p>
+            <w:pPr>
+              <w:spacing w:after="0"/>
+            </w:pPr>
+            <w:r>
+              <w:rPr>
+                <w:rFonts w:ascii="Aptos" w:hAnsi="Aptos"/>
+                <w:b w:val="0"/>
+                <w:color w:val="17384B"/>
+                <w:sz w:val="17"/>
+              </w:rPr>
+              <w:t>React PWA sends structured route input to Java. Java retrieves matching PostgreSQL criteria, then fixes the route.</w:t>
+            </w:r>
+          </w:p>
+        </w:tc>
+        <w:tc>
+          <w:tcPr>
+            <w:tcW w:type="dxa" w:w="2736"/>
+            <w:tcBorders>
+              <w:top w:val="single" w:sz="6" w:color="C7DFDB"/>
+              <w:left w:val="single" w:sz="6" w:color="C7DFDB"/>
+              <w:bottom w:val="single" w:sz="6" w:color="C7DFDB"/>
+              <w:right w:val="single" w:sz="6" w:color="C7DFDB"/>
+            </w:tcBorders>
+            <w:tcMar>
+              <w:top w:w="90" w:type="dxa"/>
+              <w:start w:w="120" w:type="dxa"/>
+              <w:bottom w:w="90" w:type="dxa"/>
+              <w:end w:w="120" w:type="dxa"/>
+            </w:tcMar>
+            <w:vAlign w:val="top"/>
+          </w:tcPr>
+          <w:p>
+            <w:pPr>
+              <w:spacing w:after="0"/>
+            </w:pPr>
+            <w:r>
+              <w:rPr>
+                <w:rFonts w:ascii="Aptos" w:hAnsi="Aptos"/>
+                <w:b w:val="0"/>
+                <w:color w:val="17384B"/>
+                <w:sz w:val="17"/>
+              </w:rPr>
+              <w:t>Only Java and matching criteria decide the route.</w:t>
+            </w:r>
+          </w:p>
+        </w:tc>
+      </w:tr>
+      <w:tr>
+        <w:tc>
+          <w:tcPr>
+            <w:tcW w:type="dxa" w:w="1080"/>
+            <w:tcBorders>
+              <w:top w:val="single" w:sz="6" w:color="C7DFDB"/>
+              <w:left w:val="single" w:sz="6" w:color="C7DFDB"/>
+              <w:bottom w:val="single" w:sz="6" w:color="C7DFDB"/>
+              <w:right w:val="single" w:sz="6" w:color="C7DFDB"/>
+            </w:tcBorders>
+            <w:tcMar>
+              <w:top w:w="90" w:type="dxa"/>
+              <w:start w:w="120" w:type="dxa"/>
+              <w:bottom w:w="90" w:type="dxa"/>
+              <w:end w:w="120" w:type="dxa"/>
+            </w:tcMar>
+            <w:vAlign w:val="top"/>
+          </w:tcPr>
+          <w:p>
+            <w:pPr>
+              <w:spacing w:after="0"/>
+            </w:pPr>
+            <w:r>
+              <w:rPr>
+                <w:rFonts w:ascii="Aptos" w:hAnsi="Aptos"/>
+                <w:b w:val="0"/>
+                <w:color w:val="17384B"/>
+                <w:sz w:val="17"/>
+              </w:rPr>
+              <w:t>4-5</w:t>
+            </w:r>
+          </w:p>
+        </w:tc>
+        <w:tc>
+          <w:tcPr>
+            <w:tcW w:type="dxa" w:w="5328"/>
+            <w:tcBorders>
+              <w:top w:val="single" w:sz="6" w:color="C7DFDB"/>
+              <w:left w:val="single" w:sz="6" w:color="C7DFDB"/>
+              <w:bottom w:val="single" w:sz="6" w:color="C7DFDB"/>
+              <w:right w:val="single" w:sz="6" w:color="C7DFDB"/>
+            </w:tcBorders>
+            <w:tcMar>
+              <w:top w:w="90" w:type="dxa"/>
+              <w:start w:w="120" w:type="dxa"/>
+              <w:bottom w:w="90" w:type="dxa"/>
+              <w:end w:w="120" w:type="dxa"/>
+            </w:tcMar>
+            <w:vAlign w:val="top"/>
+          </w:tcPr>
+          <w:p>
+            <w:pPr>
+              <w:spacing w:after="0"/>
+            </w:pPr>
+            <w:r>
+              <w:rPr>
+                <w:rFonts w:ascii="Aptos" w:hAnsi="Aptos"/>
+                <w:b w:val="0"/>
+                <w:color w:val="17384B"/>
+                <w:sz w:val="17"/>
+              </w:rPr>
+              <w:t>Java retrieves route-specific PostgreSQL RAG guidance and sources after the route is fixed.</w:t>
+            </w:r>
+          </w:p>
+        </w:tc>
+        <w:tc>
+          <w:tcPr>
+            <w:tcW w:type="dxa" w:w="2736"/>
+            <w:tcBorders>
+              <w:top w:val="single" w:sz="6" w:color="C7DFDB"/>
+              <w:left w:val="single" w:sz="6" w:color="C7DFDB"/>
+              <w:bottom w:val="single" w:sz="6" w:color="C7DFDB"/>
+              <w:right w:val="single" w:sz="6" w:color="C7DFDB"/>
+            </w:tcBorders>
+            <w:tcMar>
+              <w:top w:w="90" w:type="dxa"/>
+              <w:start w:w="120" w:type="dxa"/>
+              <w:bottom w:w="90" w:type="dxa"/>
+              <w:end w:w="120" w:type="dxa"/>
+            </w:tcMar>
+            <w:vAlign w:val="top"/>
+          </w:tcPr>
+          <w:p>
+            <w:pPr>
+              <w:spacing w:after="0"/>
+            </w:pPr>
+            <w:r>
+              <w:rPr>
+                <w:rFonts w:ascii="Aptos" w:hAnsi="Aptos"/>
+                <w:b w:val="0"/>
+                <w:color w:val="17384B"/>
+                <w:sz w:val="17"/>
+              </w:rPr>
+              <w:t>RAG cannot re-evaluate urgency.</w:t>
+            </w:r>
+          </w:p>
+        </w:tc>
+      </w:tr>
+      <w:tr>
+        <w:tc>
+          <w:tcPr>
+            <w:tcW w:type="dxa" w:w="1080"/>
+            <w:tcBorders>
+              <w:top w:val="single" w:sz="6" w:color="C7DFDB"/>
+              <w:left w:val="single" w:sz="6" w:color="C7DFDB"/>
+              <w:bottom w:val="single" w:sz="6" w:color="C7DFDB"/>
+              <w:right w:val="single" w:sz="6" w:color="C7DFDB"/>
+            </w:tcBorders>
+            <w:tcMar>
+              <w:top w:w="90" w:type="dxa"/>
+              <w:start w:w="120" w:type="dxa"/>
+              <w:bottom w:w="90" w:type="dxa"/>
+              <w:end w:w="120" w:type="dxa"/>
+            </w:tcMar>
+            <w:vAlign w:val="top"/>
+          </w:tcPr>
+          <w:p>
+            <w:pPr>
+              <w:spacing w:after="0"/>
+            </w:pPr>
+            <w:r>
+              <w:rPr>
+                <w:rFonts w:ascii="Aptos" w:hAnsi="Aptos"/>
+                <w:b w:val="0"/>
+                <w:color w:val="17384B"/>
+                <w:sz w:val="17"/>
+              </w:rPr>
+              <w:t>6-7</w:t>
+            </w:r>
+          </w:p>
+        </w:tc>
+        <w:tc>
+          <w:tcPr>
+            <w:tcW w:type="dxa" w:w="5328"/>
+            <w:tcBorders>
+              <w:top w:val="single" w:sz="6" w:color="C7DFDB"/>
+              <w:left w:val="single" w:sz="6" w:color="C7DFDB"/>
+              <w:bottom w:val="single" w:sz="6" w:color="C7DFDB"/>
+              <w:right w:val="single" w:sz="6" w:color="C7DFDB"/>
+            </w:tcBorders>
+            <w:tcMar>
+              <w:top w:w="90" w:type="dxa"/>
+              <w:start w:w="120" w:type="dxa"/>
+              <w:bottom w:w="90" w:type="dxa"/>
+              <w:end w:w="120" w:type="dxa"/>
+            </w:tcMar>
+            <w:vAlign w:val="top"/>
+          </w:tcPr>
+          <w:p>
+            <w:pPr>
+              <w:spacing w:after="0"/>
+            </w:pPr>
+            <w:r>
+              <w:rPr>
+                <w:rFonts w:ascii="Aptos" w:hAnsi="Aptos"/>
+                <w:b w:val="0"/>
+                <w:color w:val="17384B"/>
+                <w:sz w:val="17"/>
+              </w:rPr>
+              <w:t>If enabled, Java sends only controlled route guidance to local Ollama and receives Bengali explanation.</w:t>
+            </w:r>
+          </w:p>
+        </w:tc>
+        <w:tc>
+          <w:tcPr>
+            <w:tcW w:type="dxa" w:w="2736"/>
+            <w:tcBorders>
+              <w:top w:val="single" w:sz="6" w:color="C7DFDB"/>
+              <w:left w:val="single" w:sz="6" w:color="C7DFDB"/>
+              <w:bottom w:val="single" w:sz="6" w:color="C7DFDB"/>
+              <w:right w:val="single" w:sz="6" w:color="C7DFDB"/>
+            </w:tcBorders>
+            <w:tcMar>
+              <w:top w:w="90" w:type="dxa"/>
+              <w:start w:w="120" w:type="dxa"/>
+              <w:bottom w:w="90" w:type="dxa"/>
+              <w:end w:w="120" w:type="dxa"/>
+            </w:tcMar>
+            <w:vAlign w:val="top"/>
+          </w:tcPr>
+          <w:p>
+            <w:pPr>
+              <w:spacing w:after="0"/>
+            </w:pPr>
+            <w:r>
+              <w:rPr>
+                <w:rFonts w:ascii="Aptos" w:hAnsi="Aptos"/>
+                <w:b w:val="0"/>
+                <w:color w:val="17384B"/>
+                <w:sz w:val="17"/>
+              </w:rPr>
+              <w:t>No free text, voice, patient details, precise location, photos, or records are sent.</w:t>
+            </w:r>
+          </w:p>
+        </w:tc>
+      </w:tr>
+      <w:tr>
+        <w:tc>
+          <w:tcPr>
+            <w:tcW w:type="dxa" w:w="1080"/>
+            <w:tcBorders>
+              <w:top w:val="single" w:sz="6" w:color="C7DFDB"/>
+              <w:left w:val="single" w:sz="6" w:color="C7DFDB"/>
+              <w:bottom w:val="single" w:sz="6" w:color="C7DFDB"/>
+              <w:right w:val="single" w:sz="6" w:color="C7DFDB"/>
+            </w:tcBorders>
+            <w:tcMar>
+              <w:top w:w="90" w:type="dxa"/>
+              <w:start w:w="120" w:type="dxa"/>
+              <w:bottom w:w="90" w:type="dxa"/>
+              <w:end w:w="120" w:type="dxa"/>
+            </w:tcMar>
+            <w:vAlign w:val="top"/>
+          </w:tcPr>
+          <w:p>
+            <w:pPr>
+              <w:spacing w:after="0"/>
+            </w:pPr>
+            <w:r>
+              <w:rPr>
+                <w:rFonts w:ascii="Aptos" w:hAnsi="Aptos"/>
+                <w:b w:val="0"/>
+                <w:color w:val="17384B"/>
+                <w:sz w:val="17"/>
+              </w:rPr>
+              <w:t>8-10</w:t>
+            </w:r>
+          </w:p>
+        </w:tc>
+        <w:tc>
+          <w:tcPr>
+            <w:tcW w:type="dxa" w:w="5328"/>
+            <w:tcBorders>
+              <w:top w:val="single" w:sz="6" w:color="C7DFDB"/>
+              <w:left w:val="single" w:sz="6" w:color="C7DFDB"/>
+              <w:bottom w:val="single" w:sz="6" w:color="C7DFDB"/>
+              <w:right w:val="single" w:sz="6" w:color="C7DFDB"/>
+            </w:tcBorders>
+            <w:tcMar>
+              <w:top w:w="90" w:type="dxa"/>
+              <w:start w:w="120" w:type="dxa"/>
+              <w:bottom w:w="90" w:type="dxa"/>
+              <w:end w:w="120" w:type="dxa"/>
+            </w:tcMar>
+            <w:vAlign w:val="top"/>
+          </w:tcPr>
+          <w:p>
+            <w:pPr>
+              <w:spacing w:after="0"/>
+            </w:pPr>
+            <w:r>
+              <w:rPr>
+                <w:rFonts w:ascii="Aptos" w:hAnsi="Aptos"/>
+                <w:b w:val="0"/>
+                <w:color w:val="17384B"/>
+                <w:sz w:val="17"/>
+              </w:rPr>
+              <w:t>Java safety policy validates output, chooses fallback if necessary, and returns the fixed route plus one guidance source to UI.</w:t>
+            </w:r>
+          </w:p>
+        </w:tc>
+        <w:tc>
+          <w:tcPr>
+            <w:tcW w:type="dxa" w:w="2736"/>
+            <w:tcBorders>
+              <w:top w:val="single" w:sz="6" w:color="C7DFDB"/>
+              <w:left w:val="single" w:sz="6" w:color="C7DFDB"/>
+              <w:bottom w:val="single" w:sz="6" w:color="C7DFDB"/>
+              <w:right w:val="single" w:sz="6" w:color="C7DFDB"/>
+            </w:tcBorders>
+            <w:tcMar>
+              <w:top w:w="90" w:type="dxa"/>
+              <w:start w:w="120" w:type="dxa"/>
+              <w:bottom w:w="90" w:type="dxa"/>
+              <w:end w:w="120" w:type="dxa"/>
+            </w:tcMar>
+            <w:vAlign w:val="top"/>
+          </w:tcPr>
+          <w:p>
+            <w:pPr>
+              <w:spacing w:after="0"/>
+            </w:pPr>
+            <w:r>
+              <w:rPr>
+                <w:rFonts w:ascii="Aptos" w:hAnsi="Aptos"/>
+                <w:b w:val="0"/>
+                <w:color w:val="17384B"/>
+                <w:sz w:val="17"/>
+              </w:rPr>
+              <w:t>Validation/fallback cannot change route.</w:t>
+            </w:r>
+          </w:p>
+        </w:tc>
+      </w:tr>
+    </w:tbl>
+    <w:p>
+      <w:pPr>
+        <w:spacing w:after="20"/>
+      </w:pPr>
+    </w:p>
+    <w:p>
+      <w:pPr>
+        <w:spacing w:before="260" w:after="100"/>
+      </w:pPr>
+      <w:r>
+        <w:rPr>
+          <w:rFonts w:ascii="Aptos" w:hAnsi="Aptos"/>
+          <w:b/>
+          <w:color w:val="2F6FAF"/>
+          <w:sz w:val="34"/>
+        </w:rPr>
+        <w:t>3. Current safety boundary</w:t>
       </w:r>
     </w:p>
     <w:p>
@@ -2224,7 +2763,7 @@
           <w:color w:val="2F6FAF"/>
           <w:sz w:val="34"/>
         </w:rPr>
-        <w:t>3. PostgreSQL RAG and local Ollama</w:t>
+        <w:t>4. PostgreSQL RAG and local Ollama</w:t>
       </w:r>
     </w:p>
     <w:tbl>
@@ -2847,7 +3386,7 @@
           <w:color w:val="2F6FAF"/>
           <w:sz w:val="34"/>
         </w:rPr>
-        <w:t>4. Security, privacy, and governance controls</w:t>
+        <w:t>5. Security, privacy, and governance controls</w:t>
       </w:r>
     </w:p>
     <w:tbl>
@@ -3568,7 +4107,7 @@
           <w:color w:val="2F6FAF"/>
           <w:sz w:val="34"/>
         </w:rPr>
-        <w:t>5. Current capstone gaps and roadmap</w:t>
+        <w:t>6. Current capstone gaps and roadmap</w:t>
       </w:r>
     </w:p>
     <w:tbl>
@@ -4289,7 +4828,7 @@
           <w:color w:val="2F6FAF"/>
           <w:sz w:val="34"/>
         </w:rPr>
-        <w:t>6. Deployment and future controlled scope</w:t>
+        <w:t>7. Deployment and future controlled scope</w:t>
       </w:r>
     </w:p>
     <w:tbl>

</xml_diff>